<commit_message>
feat: add revisi tanggal 12 may
</commit_message>
<xml_diff>
--- a/laporan/PROPOSAL TUGAS AKHIR.docx
+++ b/laporan/PROPOSAL TUGAS AKHIR.docx
@@ -1,6 +1,6 @@
 
 <file path=word/document.xml><?xml version="1.0" encoding="utf-8"?>
-<w:document xmlns:wpc="http://schemas.microsoft.com/office/word/2010/wordprocessingCanvas" xmlns:cx="http://schemas.microsoft.com/office/drawing/2014/chartex" xmlns:cx1="http://schemas.microsoft.com/office/drawing/2015/9/8/chartex" xmlns:cx2="http://schemas.microsoft.com/office/drawing/2015/10/21/chartex" xmlns:cx3="http://schemas.microsoft.com/office/drawing/2016/5/9/chartex" xmlns:cx4="http://schemas.microsoft.com/office/drawing/2016/5/10/chartex" xmlns:cx5="http://schemas.microsoft.com/office/drawing/2016/5/11/chartex" xmlns:cx6="http://schemas.microsoft.com/office/drawing/2016/5/12/chartex" xmlns:cx7="http://schemas.microsoft.com/office/drawing/2016/5/13/chartex" xmlns:cx8="http://schemas.microsoft.com/office/drawing/2016/5/14/chartex" xmlns:mc="http://schemas.openxmlformats.org/markup-compatibility/2006" xmlns:aink="http://schemas.microsoft.com/office/drawing/2016/ink" xmlns:am3d="http://schemas.microsoft.com/office/drawing/2017/model3d" xmlns:o="urn:schemas-microsoft-com:office:office" xmlns:oel="http://schemas.microsoft.com/office/2019/extlst" xmlns:r="http://schemas.openxmlformats.org/officeDocument/2006/relationships" xmlns:m="http://schemas.openxmlformats.org/officeDocument/2006/math" xmlns:v="urn:schemas-microsoft-com:vml" xmlns:wp14="http://schemas.microsoft.com/office/word/2010/wordprocessingDrawing" xmlns:wp="http://schemas.openxmlformats.org/drawingml/2006/wordprocessingDrawing" xmlns:w10="urn:schemas-microsoft-com:office:word" xmlns:w="http://schemas.openxmlformats.org/wordprocessingml/2006/main" xmlns:w14="http://schemas.microsoft.com/office/word/2010/wordml" xmlns:w15="http://schemas.microsoft.com/office/word/2012/wordml" xmlns:w16cex="http://schemas.microsoft.com/office/word/2018/wordml/cex" xmlns:w16cid="http://schemas.microsoft.com/office/word/2016/wordml/cid" xmlns:w16="http://schemas.microsoft.com/office/word/2018/wordml" xmlns:w16du="http://schemas.microsoft.com/office/word/2023/wordml/word16du" xmlns:w16sdtdh="http://schemas.microsoft.com/office/word/2020/wordml/sdtdatahash" xmlns:w16sdtfl="http://schemas.microsoft.com/office/word/2024/wordml/sdtformatlock" xmlns:w16se="http://schemas.microsoft.com/office/word/2015/wordml/symex" xmlns:wpg="http://schemas.microsoft.com/office/word/2010/wordprocessingGroup" xmlns:wpi="http://schemas.microsoft.com/office/word/2010/wordprocessingInk" xmlns:wne="http://schemas.microsoft.com/office/word/2006/wordml" xmlns:wps="http://schemas.microsoft.com/office/word/2010/wordprocessingShape" mc:Ignorable="w14 w15 w16se w16cid w16 w16cex w16sdtdh w16sdtfl w16du wp14">
+<w:document xmlns:wpc="http://schemas.microsoft.com/office/word/2010/wordprocessingCanvas" xmlns:cx="http://schemas.microsoft.com/office/drawing/2014/chartex" xmlns:cx1="http://schemas.microsoft.com/office/drawing/2015/9/8/chartex" xmlns:cx2="http://schemas.microsoft.com/office/drawing/2015/10/21/chartex" xmlns:cx3="http://schemas.microsoft.com/office/drawing/2016/5/9/chartex" xmlns:cx4="http://schemas.microsoft.com/office/drawing/2016/5/10/chartex" xmlns:cx5="http://schemas.microsoft.com/office/drawing/2016/5/11/chartex" xmlns:cx6="http://schemas.microsoft.com/office/drawing/2016/5/12/chartex" xmlns:cx7="http://schemas.microsoft.com/office/drawing/2016/5/13/chartex" xmlns:cx8="http://schemas.microsoft.com/office/drawing/2016/5/14/chartex" xmlns:mc="http://schemas.openxmlformats.org/markup-compatibility/2006" xmlns:aink="http://schemas.microsoft.com/office/drawing/2016/ink" xmlns:am3d="http://schemas.microsoft.com/office/drawing/2017/model3d" xmlns:o="urn:schemas-microsoft-com:office:office" xmlns:oel="http://schemas.microsoft.com/office/2019/extlst" xmlns:r="http://schemas.openxmlformats.org/officeDocument/2006/relationships" xmlns:m="http://schemas.openxmlformats.org/officeDocument/2006/math" xmlns:v="urn:schemas-microsoft-com:vml" xmlns:wp14="http://schemas.microsoft.com/office/word/2010/wordprocessingDrawing" xmlns:wp="http://schemas.openxmlformats.org/drawingml/2006/wordprocessingDrawing" xmlns:w10="urn:schemas-microsoft-com:office:word" xmlns:w="http://schemas.openxmlformats.org/wordprocessingml/2006/main" xmlns:w14="http://schemas.microsoft.com/office/word/2010/wordml" xmlns:w15="http://schemas.microsoft.com/office/word/2012/wordml" xmlns:w16cex="http://schemas.microsoft.com/office/word/2018/wordml/cex" xmlns:w16cid="http://schemas.microsoft.com/office/word/2016/wordml/cid" xmlns:w16="http://schemas.microsoft.com/office/word/2018/wordml" xmlns:w16sdtdh="http://schemas.microsoft.com/office/word/2020/wordml/sdtdatahash" xmlns:w16se="http://schemas.microsoft.com/office/word/2015/wordml/symex" xmlns:wpg="http://schemas.microsoft.com/office/word/2010/wordprocessingGroup" xmlns:wpi="http://schemas.microsoft.com/office/word/2010/wordprocessingInk" xmlns:wne="http://schemas.microsoft.com/office/word/2006/wordml" xmlns:wps="http://schemas.microsoft.com/office/word/2010/wordprocessingShape" mc:Ignorable="w14 w15 w16se w16cid w16 w16cex w16sdtdh wp14">
   <w:body>
     <w:p>
       <w:pPr>
@@ -1036,7 +1036,7 @@
                 <w:noProof/>
                 <w:webHidden/>
               </w:rPr>
-              <w:t>3</w:t>
+              <w:t>2</w:t>
             </w:r>
             <w:r>
               <w:rPr>
@@ -2869,7 +2869,7 @@
             <w:noProof/>
             <w:webHidden/>
           </w:rPr>
-          <w:t>8</w:t>
+          <w:t>7</w:t>
         </w:r>
         <w:r>
           <w:rPr>
@@ -18916,7 +18916,7 @@
           <w:szCs w:val="24"/>
           <w:lang w:val="en-ID"/>
         </w:rPr>
-        <w:t xml:space="preserve"> "</w:t>
+        <w:t xml:space="preserve"> "Tugas </w:t>
       </w:r>
       <w:proofErr w:type="spellStart"/>
       <w:r>
@@ -18926,7 +18926,7 @@
           <w:szCs w:val="24"/>
           <w:lang w:val="en-ID"/>
         </w:rPr>
-        <w:t>Tugas</w:t>
+        <w:t>Preteks</w:t>
       </w:r>
       <w:proofErr w:type="spellEnd"/>
       <w:r>
@@ -18936,19 +18936,19 @@
           <w:szCs w:val="24"/>
           <w:lang w:val="en-ID"/>
         </w:rPr>
-        <w:t xml:space="preserve"> </w:t>
-      </w:r>
-      <w:proofErr w:type="spellStart"/>
-      <w:r>
-        <w:rPr>
-          <w:rFonts w:ascii="Times New Roman" w:hAnsi="Times New Roman" w:cs="Times New Roman"/>
+        <w:t>" (</w:t>
+      </w:r>
+      <w:r>
+        <w:rPr>
+          <w:rFonts w:ascii="Times New Roman" w:hAnsi="Times New Roman" w:cs="Times New Roman"/>
+          <w:i/>
+          <w:iCs/>
           <w:sz w:val="24"/>
           <w:szCs w:val="24"/>
           <w:lang w:val="en-ID"/>
         </w:rPr>
-        <w:t>Preteks</w:t>
-      </w:r>
-      <w:proofErr w:type="spellEnd"/>
+        <w:t>Pretext Task</w:t>
+      </w:r>
       <w:r>
         <w:rPr>
           <w:rFonts w:ascii="Times New Roman" w:hAnsi="Times New Roman" w:cs="Times New Roman"/>
@@ -18956,47 +18956,7 @@
           <w:szCs w:val="24"/>
           <w:lang w:val="en-ID"/>
         </w:rPr>
-        <w:t>" (</w:t>
-      </w:r>
-      <w:r>
-        <w:rPr>
-          <w:rFonts w:ascii="Times New Roman" w:hAnsi="Times New Roman" w:cs="Times New Roman"/>
-          <w:i/>
-          <w:iCs/>
-          <w:sz w:val="24"/>
-          <w:szCs w:val="24"/>
-          <w:lang w:val="en-ID"/>
-        </w:rPr>
-        <w:t>Pretext Task</w:t>
-      </w:r>
-      <w:r>
-        <w:rPr>
-          <w:rFonts w:ascii="Times New Roman" w:hAnsi="Times New Roman" w:cs="Times New Roman"/>
-          <w:sz w:val="24"/>
-          <w:szCs w:val="24"/>
-          <w:lang w:val="en-ID"/>
-        </w:rPr>
-        <w:t xml:space="preserve">). </w:t>
-      </w:r>
-      <w:proofErr w:type="spellStart"/>
-      <w:r>
-        <w:rPr>
-          <w:rFonts w:ascii="Times New Roman" w:hAnsi="Times New Roman" w:cs="Times New Roman"/>
-          <w:sz w:val="24"/>
-          <w:szCs w:val="24"/>
-          <w:lang w:val="en-ID"/>
-        </w:rPr>
-        <w:t>Tugas</w:t>
-      </w:r>
-      <w:proofErr w:type="spellEnd"/>
-      <w:r>
-        <w:rPr>
-          <w:rFonts w:ascii="Times New Roman" w:hAnsi="Times New Roman" w:cs="Times New Roman"/>
-          <w:sz w:val="24"/>
-          <w:szCs w:val="24"/>
-          <w:lang w:val="en-ID"/>
-        </w:rPr>
-        <w:t xml:space="preserve"> </w:t>
+        <w:t xml:space="preserve">). Tugas </w:t>
       </w:r>
       <w:proofErr w:type="spellStart"/>
       <w:r>
@@ -19351,29 +19311,7 @@
           <w:color w:val="auto"/>
           <w:lang w:val="en-ID"/>
         </w:rPr>
-        <w:t xml:space="preserve"> </w:t>
-      </w:r>
-      <w:proofErr w:type="spellStart"/>
-      <w:r>
-        <w:rPr>
-          <w:rFonts w:ascii="Times New Roman" w:hAnsi="Times New Roman" w:cs="Times New Roman"/>
-          <w:b/>
-          <w:bCs/>
-          <w:color w:val="auto"/>
-          <w:lang w:val="en-ID"/>
-        </w:rPr>
-        <w:t>Kontekstual</w:t>
-      </w:r>
-      <w:proofErr w:type="spellEnd"/>
-      <w:r>
-        <w:rPr>
-          <w:rFonts w:ascii="Times New Roman" w:hAnsi="Times New Roman" w:cs="Times New Roman"/>
-          <w:b/>
-          <w:bCs/>
-          <w:color w:val="auto"/>
-          <w:lang w:val="en-ID"/>
-        </w:rPr>
-        <w:t xml:space="preserve"> </w:t>
+        <w:t xml:space="preserve"> Kontekstual </w:t>
       </w:r>
       <w:proofErr w:type="spellStart"/>
       <w:r>
@@ -28770,7 +28708,29 @@
                 <w:szCs w:val="24"/>
                 <w:lang w:eastAsia="en-ID"/>
               </w:rPr>
-              <w:t xml:space="preserve"> Similarity + FAISS)</w:t>
+              <w:t xml:space="preserve"> </w:t>
+            </w:r>
+            <w:proofErr w:type="spellStart"/>
+            <w:r>
+              <w:rPr>
+                <w:rFonts w:ascii="Times New Roman" w:eastAsia="Times New Roman" w:hAnsi="Times New Roman" w:cs="Times New Roman"/>
+                <w:color w:val="000000"/>
+                <w:sz w:val="24"/>
+                <w:szCs w:val="24"/>
+                <w:lang w:eastAsia="en-ID"/>
+              </w:rPr>
+              <w:t>Similarity</w:t>
+            </w:r>
+            <w:proofErr w:type="spellEnd"/>
+            <w:r>
+              <w:rPr>
+                <w:rFonts w:ascii="Times New Roman" w:eastAsia="Times New Roman" w:hAnsi="Times New Roman" w:cs="Times New Roman"/>
+                <w:color w:val="000000"/>
+                <w:sz w:val="24"/>
+                <w:szCs w:val="24"/>
+                <w:lang w:eastAsia="en-ID"/>
+              </w:rPr>
+              <w:t xml:space="preserve"> + FAISS)</w:t>
             </w:r>
           </w:p>
         </w:tc>
@@ -30794,7 +30754,7 @@
 </file>
 
 <file path=word/endnotes.xml><?xml version="1.0" encoding="utf-8"?>
-<w:endnotes xmlns:wpc="http://schemas.microsoft.com/office/word/2010/wordprocessingCanvas" xmlns:cx="http://schemas.microsoft.com/office/drawing/2014/chartex" xmlns:cx1="http://schemas.microsoft.com/office/drawing/2015/9/8/chartex" xmlns:cx2="http://schemas.microsoft.com/office/drawing/2015/10/21/chartex" xmlns:cx3="http://schemas.microsoft.com/office/drawing/2016/5/9/chartex" xmlns:cx4="http://schemas.microsoft.com/office/drawing/2016/5/10/chartex" xmlns:cx5="http://schemas.microsoft.com/office/drawing/2016/5/11/chartex" xmlns:cx6="http://schemas.microsoft.com/office/drawing/2016/5/12/chartex" xmlns:cx7="http://schemas.microsoft.com/office/drawing/2016/5/13/chartex" xmlns:cx8="http://schemas.microsoft.com/office/drawing/2016/5/14/chartex" xmlns:mc="http://schemas.openxmlformats.org/markup-compatibility/2006" xmlns:aink="http://schemas.microsoft.com/office/drawing/2016/ink" xmlns:am3d="http://schemas.microsoft.com/office/drawing/2017/model3d" xmlns:o="urn:schemas-microsoft-com:office:office" xmlns:oel="http://schemas.microsoft.com/office/2019/extlst" xmlns:r="http://schemas.openxmlformats.org/officeDocument/2006/relationships" xmlns:m="http://schemas.openxmlformats.org/officeDocument/2006/math" xmlns:v="urn:schemas-microsoft-com:vml" xmlns:wp14="http://schemas.microsoft.com/office/word/2010/wordprocessingDrawing" xmlns:wp="http://schemas.openxmlformats.org/drawingml/2006/wordprocessingDrawing" xmlns:w10="urn:schemas-microsoft-com:office:word" xmlns:w="http://schemas.openxmlformats.org/wordprocessingml/2006/main" xmlns:w14="http://schemas.microsoft.com/office/word/2010/wordml" xmlns:w15="http://schemas.microsoft.com/office/word/2012/wordml" xmlns:w16cex="http://schemas.microsoft.com/office/word/2018/wordml/cex" xmlns:w16cid="http://schemas.microsoft.com/office/word/2016/wordml/cid" xmlns:w16="http://schemas.microsoft.com/office/word/2018/wordml" xmlns:w16du="http://schemas.microsoft.com/office/word/2023/wordml/word16du" xmlns:w16sdtdh="http://schemas.microsoft.com/office/word/2020/wordml/sdtdatahash" xmlns:w16sdtfl="http://schemas.microsoft.com/office/word/2024/wordml/sdtformatlock" xmlns:w16se="http://schemas.microsoft.com/office/word/2015/wordml/symex" xmlns:wpg="http://schemas.microsoft.com/office/word/2010/wordprocessingGroup" xmlns:wpi="http://schemas.microsoft.com/office/word/2010/wordprocessingInk" xmlns:wne="http://schemas.microsoft.com/office/word/2006/wordml" xmlns:wps="http://schemas.microsoft.com/office/word/2010/wordprocessingShape" mc:Ignorable="w14 w15 w16se w16cid w16 w16cex w16sdtdh w16sdtfl w16du wp14">
+<w:endnotes xmlns:wpc="http://schemas.microsoft.com/office/word/2010/wordprocessingCanvas" xmlns:cx="http://schemas.microsoft.com/office/drawing/2014/chartex" xmlns:cx1="http://schemas.microsoft.com/office/drawing/2015/9/8/chartex" xmlns:cx2="http://schemas.microsoft.com/office/drawing/2015/10/21/chartex" xmlns:cx3="http://schemas.microsoft.com/office/drawing/2016/5/9/chartex" xmlns:cx4="http://schemas.microsoft.com/office/drawing/2016/5/10/chartex" xmlns:cx5="http://schemas.microsoft.com/office/drawing/2016/5/11/chartex" xmlns:cx6="http://schemas.microsoft.com/office/drawing/2016/5/12/chartex" xmlns:cx7="http://schemas.microsoft.com/office/drawing/2016/5/13/chartex" xmlns:cx8="http://schemas.microsoft.com/office/drawing/2016/5/14/chartex" xmlns:mc="http://schemas.openxmlformats.org/markup-compatibility/2006" xmlns:aink="http://schemas.microsoft.com/office/drawing/2016/ink" xmlns:am3d="http://schemas.microsoft.com/office/drawing/2017/model3d" xmlns:o="urn:schemas-microsoft-com:office:office" xmlns:oel="http://schemas.microsoft.com/office/2019/extlst" xmlns:r="http://schemas.openxmlformats.org/officeDocument/2006/relationships" xmlns:m="http://schemas.openxmlformats.org/officeDocument/2006/math" xmlns:v="urn:schemas-microsoft-com:vml" xmlns:wp14="http://schemas.microsoft.com/office/word/2010/wordprocessingDrawing" xmlns:wp="http://schemas.openxmlformats.org/drawingml/2006/wordprocessingDrawing" xmlns:w10="urn:schemas-microsoft-com:office:word" xmlns:w="http://schemas.openxmlformats.org/wordprocessingml/2006/main" xmlns:w14="http://schemas.microsoft.com/office/word/2010/wordml" xmlns:w15="http://schemas.microsoft.com/office/word/2012/wordml" xmlns:w16cex="http://schemas.microsoft.com/office/word/2018/wordml/cex" xmlns:w16cid="http://schemas.microsoft.com/office/word/2016/wordml/cid" xmlns:w16="http://schemas.microsoft.com/office/word/2018/wordml" xmlns:w16sdtdh="http://schemas.microsoft.com/office/word/2020/wordml/sdtdatahash" xmlns:w16se="http://schemas.microsoft.com/office/word/2015/wordml/symex" xmlns:wpg="http://schemas.microsoft.com/office/word/2010/wordprocessingGroup" xmlns:wpi="http://schemas.microsoft.com/office/word/2010/wordprocessingInk" xmlns:wne="http://schemas.microsoft.com/office/word/2006/wordml" xmlns:wps="http://schemas.microsoft.com/office/word/2010/wordprocessingShape" mc:Ignorable="w14 w15 w16se w16cid w16 w16cex w16sdtdh wp14">
   <w:endnote w:type="separator" w:id="-1">
     <w:p>
       <w:pPr>
@@ -30819,7 +30779,7 @@
 </file>
 
 <file path=word/footer1.xml><?xml version="1.0" encoding="utf-8"?>
-<w:ftr xmlns:wpc="http://schemas.microsoft.com/office/word/2010/wordprocessingCanvas" xmlns:cx="http://schemas.microsoft.com/office/drawing/2014/chartex" xmlns:cx1="http://schemas.microsoft.com/office/drawing/2015/9/8/chartex" xmlns:cx2="http://schemas.microsoft.com/office/drawing/2015/10/21/chartex" xmlns:cx3="http://schemas.microsoft.com/office/drawing/2016/5/9/chartex" xmlns:cx4="http://schemas.microsoft.com/office/drawing/2016/5/10/chartex" xmlns:cx5="http://schemas.microsoft.com/office/drawing/2016/5/11/chartex" xmlns:cx6="http://schemas.microsoft.com/office/drawing/2016/5/12/chartex" xmlns:cx7="http://schemas.microsoft.com/office/drawing/2016/5/13/chartex" xmlns:cx8="http://schemas.microsoft.com/office/drawing/2016/5/14/chartex" xmlns:mc="http://schemas.openxmlformats.org/markup-compatibility/2006" xmlns:aink="http://schemas.microsoft.com/office/drawing/2016/ink" xmlns:am3d="http://schemas.microsoft.com/office/drawing/2017/model3d" xmlns:o="urn:schemas-microsoft-com:office:office" xmlns:oel="http://schemas.microsoft.com/office/2019/extlst" xmlns:r="http://schemas.openxmlformats.org/officeDocument/2006/relationships" xmlns:m="http://schemas.openxmlformats.org/officeDocument/2006/math" xmlns:v="urn:schemas-microsoft-com:vml" xmlns:wp14="http://schemas.microsoft.com/office/word/2010/wordprocessingDrawing" xmlns:wp="http://schemas.openxmlformats.org/drawingml/2006/wordprocessingDrawing" xmlns:w10="urn:schemas-microsoft-com:office:word" xmlns:w="http://schemas.openxmlformats.org/wordprocessingml/2006/main" xmlns:w14="http://schemas.microsoft.com/office/word/2010/wordml" xmlns:w15="http://schemas.microsoft.com/office/word/2012/wordml" xmlns:w16cex="http://schemas.microsoft.com/office/word/2018/wordml/cex" xmlns:w16cid="http://schemas.microsoft.com/office/word/2016/wordml/cid" xmlns:w16="http://schemas.microsoft.com/office/word/2018/wordml" xmlns:w16du="http://schemas.microsoft.com/office/word/2023/wordml/word16du" xmlns:w16sdtdh="http://schemas.microsoft.com/office/word/2020/wordml/sdtdatahash" xmlns:w16sdtfl="http://schemas.microsoft.com/office/word/2024/wordml/sdtformatlock" xmlns:w16se="http://schemas.microsoft.com/office/word/2015/wordml/symex" xmlns:wpg="http://schemas.microsoft.com/office/word/2010/wordprocessingGroup" xmlns:wpi="http://schemas.microsoft.com/office/word/2010/wordprocessingInk" xmlns:wne="http://schemas.microsoft.com/office/word/2006/wordml" xmlns:wps="http://schemas.microsoft.com/office/word/2010/wordprocessingShape" mc:Ignorable="w14 w15 w16se w16cid w16 w16cex w16sdtdh w16sdtfl w16du wp14">
+<w:ftr xmlns:wpc="http://schemas.microsoft.com/office/word/2010/wordprocessingCanvas" xmlns:cx="http://schemas.microsoft.com/office/drawing/2014/chartex" xmlns:cx1="http://schemas.microsoft.com/office/drawing/2015/9/8/chartex" xmlns:cx2="http://schemas.microsoft.com/office/drawing/2015/10/21/chartex" xmlns:cx3="http://schemas.microsoft.com/office/drawing/2016/5/9/chartex" xmlns:cx4="http://schemas.microsoft.com/office/drawing/2016/5/10/chartex" xmlns:cx5="http://schemas.microsoft.com/office/drawing/2016/5/11/chartex" xmlns:cx6="http://schemas.microsoft.com/office/drawing/2016/5/12/chartex" xmlns:cx7="http://schemas.microsoft.com/office/drawing/2016/5/13/chartex" xmlns:cx8="http://schemas.microsoft.com/office/drawing/2016/5/14/chartex" xmlns:mc="http://schemas.openxmlformats.org/markup-compatibility/2006" xmlns:aink="http://schemas.microsoft.com/office/drawing/2016/ink" xmlns:am3d="http://schemas.microsoft.com/office/drawing/2017/model3d" xmlns:o="urn:schemas-microsoft-com:office:office" xmlns:oel="http://schemas.microsoft.com/office/2019/extlst" xmlns:r="http://schemas.openxmlformats.org/officeDocument/2006/relationships" xmlns:m="http://schemas.openxmlformats.org/officeDocument/2006/math" xmlns:v="urn:schemas-microsoft-com:vml" xmlns:wp14="http://schemas.microsoft.com/office/word/2010/wordprocessingDrawing" xmlns:wp="http://schemas.openxmlformats.org/drawingml/2006/wordprocessingDrawing" xmlns:w10="urn:schemas-microsoft-com:office:word" xmlns:w="http://schemas.openxmlformats.org/wordprocessingml/2006/main" xmlns:w14="http://schemas.microsoft.com/office/word/2010/wordml" xmlns:w15="http://schemas.microsoft.com/office/word/2012/wordml" xmlns:w16cex="http://schemas.microsoft.com/office/word/2018/wordml/cex" xmlns:w16cid="http://schemas.microsoft.com/office/word/2016/wordml/cid" xmlns:w16="http://schemas.microsoft.com/office/word/2018/wordml" xmlns:w16sdtdh="http://schemas.microsoft.com/office/word/2020/wordml/sdtdatahash" xmlns:w16se="http://schemas.microsoft.com/office/word/2015/wordml/symex" xmlns:wpg="http://schemas.microsoft.com/office/word/2010/wordprocessingGroup" xmlns:wpi="http://schemas.microsoft.com/office/word/2010/wordprocessingInk" xmlns:wne="http://schemas.microsoft.com/office/word/2006/wordml" xmlns:wps="http://schemas.microsoft.com/office/word/2010/wordprocessingShape" mc:Ignorable="w14 w15 w16se w16cid w16 w16cex w16sdtdh wp14">
   <w:sdt>
     <w:sdtPr>
       <w:id w:val="1253247133"/>
@@ -30872,7 +30832,7 @@
 </file>
 
 <file path=word/footer2.xml><?xml version="1.0" encoding="utf-8"?>
-<w:ftr xmlns:wpc="http://schemas.microsoft.com/office/word/2010/wordprocessingCanvas" xmlns:cx="http://schemas.microsoft.com/office/drawing/2014/chartex" xmlns:cx1="http://schemas.microsoft.com/office/drawing/2015/9/8/chartex" xmlns:cx2="http://schemas.microsoft.com/office/drawing/2015/10/21/chartex" xmlns:cx3="http://schemas.microsoft.com/office/drawing/2016/5/9/chartex" xmlns:cx4="http://schemas.microsoft.com/office/drawing/2016/5/10/chartex" xmlns:cx5="http://schemas.microsoft.com/office/drawing/2016/5/11/chartex" xmlns:cx6="http://schemas.microsoft.com/office/drawing/2016/5/12/chartex" xmlns:cx7="http://schemas.microsoft.com/office/drawing/2016/5/13/chartex" xmlns:cx8="http://schemas.microsoft.com/office/drawing/2016/5/14/chartex" xmlns:mc="http://schemas.openxmlformats.org/markup-compatibility/2006" xmlns:aink="http://schemas.microsoft.com/office/drawing/2016/ink" xmlns:am3d="http://schemas.microsoft.com/office/drawing/2017/model3d" xmlns:o="urn:schemas-microsoft-com:office:office" xmlns:oel="http://schemas.microsoft.com/office/2019/extlst" xmlns:r="http://schemas.openxmlformats.org/officeDocument/2006/relationships" xmlns:m="http://schemas.openxmlformats.org/officeDocument/2006/math" xmlns:v="urn:schemas-microsoft-com:vml" xmlns:wp14="http://schemas.microsoft.com/office/word/2010/wordprocessingDrawing" xmlns:wp="http://schemas.openxmlformats.org/drawingml/2006/wordprocessingDrawing" xmlns:w10="urn:schemas-microsoft-com:office:word" xmlns:w="http://schemas.openxmlformats.org/wordprocessingml/2006/main" xmlns:w14="http://schemas.microsoft.com/office/word/2010/wordml" xmlns:w15="http://schemas.microsoft.com/office/word/2012/wordml" xmlns:w16cex="http://schemas.microsoft.com/office/word/2018/wordml/cex" xmlns:w16cid="http://schemas.microsoft.com/office/word/2016/wordml/cid" xmlns:w16="http://schemas.microsoft.com/office/word/2018/wordml" xmlns:w16du="http://schemas.microsoft.com/office/word/2023/wordml/word16du" xmlns:w16sdtdh="http://schemas.microsoft.com/office/word/2020/wordml/sdtdatahash" xmlns:w16sdtfl="http://schemas.microsoft.com/office/word/2024/wordml/sdtformatlock" xmlns:w16se="http://schemas.microsoft.com/office/word/2015/wordml/symex" xmlns:wpg="http://schemas.microsoft.com/office/word/2010/wordprocessingGroup" xmlns:wpi="http://schemas.microsoft.com/office/word/2010/wordprocessingInk" xmlns:wne="http://schemas.microsoft.com/office/word/2006/wordml" xmlns:wps="http://schemas.microsoft.com/office/word/2010/wordprocessingShape" mc:Ignorable="w14 w15 w16se w16cid w16 w16cex w16sdtdh w16sdtfl w16du wp14">
+<w:ftr xmlns:wpc="http://schemas.microsoft.com/office/word/2010/wordprocessingCanvas" xmlns:cx="http://schemas.microsoft.com/office/drawing/2014/chartex" xmlns:cx1="http://schemas.microsoft.com/office/drawing/2015/9/8/chartex" xmlns:cx2="http://schemas.microsoft.com/office/drawing/2015/10/21/chartex" xmlns:cx3="http://schemas.microsoft.com/office/drawing/2016/5/9/chartex" xmlns:cx4="http://schemas.microsoft.com/office/drawing/2016/5/10/chartex" xmlns:cx5="http://schemas.microsoft.com/office/drawing/2016/5/11/chartex" xmlns:cx6="http://schemas.microsoft.com/office/drawing/2016/5/12/chartex" xmlns:cx7="http://schemas.microsoft.com/office/drawing/2016/5/13/chartex" xmlns:cx8="http://schemas.microsoft.com/office/drawing/2016/5/14/chartex" xmlns:mc="http://schemas.openxmlformats.org/markup-compatibility/2006" xmlns:aink="http://schemas.microsoft.com/office/drawing/2016/ink" xmlns:am3d="http://schemas.microsoft.com/office/drawing/2017/model3d" xmlns:o="urn:schemas-microsoft-com:office:office" xmlns:oel="http://schemas.microsoft.com/office/2019/extlst" xmlns:r="http://schemas.openxmlformats.org/officeDocument/2006/relationships" xmlns:m="http://schemas.openxmlformats.org/officeDocument/2006/math" xmlns:v="urn:schemas-microsoft-com:vml" xmlns:wp14="http://schemas.microsoft.com/office/word/2010/wordprocessingDrawing" xmlns:wp="http://schemas.openxmlformats.org/drawingml/2006/wordprocessingDrawing" xmlns:w10="urn:schemas-microsoft-com:office:word" xmlns:w="http://schemas.openxmlformats.org/wordprocessingml/2006/main" xmlns:w14="http://schemas.microsoft.com/office/word/2010/wordml" xmlns:w15="http://schemas.microsoft.com/office/word/2012/wordml" xmlns:w16cex="http://schemas.microsoft.com/office/word/2018/wordml/cex" xmlns:w16cid="http://schemas.microsoft.com/office/word/2016/wordml/cid" xmlns:w16="http://schemas.microsoft.com/office/word/2018/wordml" xmlns:w16sdtdh="http://schemas.microsoft.com/office/word/2020/wordml/sdtdatahash" xmlns:w16se="http://schemas.microsoft.com/office/word/2015/wordml/symex" xmlns:wpg="http://schemas.microsoft.com/office/word/2010/wordprocessingGroup" xmlns:wpi="http://schemas.microsoft.com/office/word/2010/wordprocessingInk" xmlns:wne="http://schemas.microsoft.com/office/word/2006/wordml" xmlns:wps="http://schemas.microsoft.com/office/word/2010/wordprocessingShape" mc:Ignorable="w14 w15 w16se w16cid w16 w16cex w16sdtdh wp14">
   <w:p>
     <w:pPr>
       <w:pStyle w:val="Footer"/>
@@ -30882,7 +30842,7 @@
 </file>
 
 <file path=word/footnotes.xml><?xml version="1.0" encoding="utf-8"?>
-<w:footnotes xmlns:wpc="http://schemas.microsoft.com/office/word/2010/wordprocessingCanvas" xmlns:cx="http://schemas.microsoft.com/office/drawing/2014/chartex" xmlns:cx1="http://schemas.microsoft.com/office/drawing/2015/9/8/chartex" xmlns:cx2="http://schemas.microsoft.com/office/drawing/2015/10/21/chartex" xmlns:cx3="http://schemas.microsoft.com/office/drawing/2016/5/9/chartex" xmlns:cx4="http://schemas.microsoft.com/office/drawing/2016/5/10/chartex" xmlns:cx5="http://schemas.microsoft.com/office/drawing/2016/5/11/chartex" xmlns:cx6="http://schemas.microsoft.com/office/drawing/2016/5/12/chartex" xmlns:cx7="http://schemas.microsoft.com/office/drawing/2016/5/13/chartex" xmlns:cx8="http://schemas.microsoft.com/office/drawing/2016/5/14/chartex" xmlns:mc="http://schemas.openxmlformats.org/markup-compatibility/2006" xmlns:aink="http://schemas.microsoft.com/office/drawing/2016/ink" xmlns:am3d="http://schemas.microsoft.com/office/drawing/2017/model3d" xmlns:o="urn:schemas-microsoft-com:office:office" xmlns:oel="http://schemas.microsoft.com/office/2019/extlst" xmlns:r="http://schemas.openxmlformats.org/officeDocument/2006/relationships" xmlns:m="http://schemas.openxmlformats.org/officeDocument/2006/math" xmlns:v="urn:schemas-microsoft-com:vml" xmlns:wp14="http://schemas.microsoft.com/office/word/2010/wordprocessingDrawing" xmlns:wp="http://schemas.openxmlformats.org/drawingml/2006/wordprocessingDrawing" xmlns:w10="urn:schemas-microsoft-com:office:word" xmlns:w="http://schemas.openxmlformats.org/wordprocessingml/2006/main" xmlns:w14="http://schemas.microsoft.com/office/word/2010/wordml" xmlns:w15="http://schemas.microsoft.com/office/word/2012/wordml" xmlns:w16cex="http://schemas.microsoft.com/office/word/2018/wordml/cex" xmlns:w16cid="http://schemas.microsoft.com/office/word/2016/wordml/cid" xmlns:w16="http://schemas.microsoft.com/office/word/2018/wordml" xmlns:w16du="http://schemas.microsoft.com/office/word/2023/wordml/word16du" xmlns:w16sdtdh="http://schemas.microsoft.com/office/word/2020/wordml/sdtdatahash" xmlns:w16sdtfl="http://schemas.microsoft.com/office/word/2024/wordml/sdtformatlock" xmlns:w16se="http://schemas.microsoft.com/office/word/2015/wordml/symex" xmlns:wpg="http://schemas.microsoft.com/office/word/2010/wordprocessingGroup" xmlns:wpi="http://schemas.microsoft.com/office/word/2010/wordprocessingInk" xmlns:wne="http://schemas.microsoft.com/office/word/2006/wordml" xmlns:wps="http://schemas.microsoft.com/office/word/2010/wordprocessingShape" mc:Ignorable="w14 w15 w16se w16cid w16 w16cex w16sdtdh w16sdtfl w16du wp14">
+<w:footnotes xmlns:wpc="http://schemas.microsoft.com/office/word/2010/wordprocessingCanvas" xmlns:cx="http://schemas.microsoft.com/office/drawing/2014/chartex" xmlns:cx1="http://schemas.microsoft.com/office/drawing/2015/9/8/chartex" xmlns:cx2="http://schemas.microsoft.com/office/drawing/2015/10/21/chartex" xmlns:cx3="http://schemas.microsoft.com/office/drawing/2016/5/9/chartex" xmlns:cx4="http://schemas.microsoft.com/office/drawing/2016/5/10/chartex" xmlns:cx5="http://schemas.microsoft.com/office/drawing/2016/5/11/chartex" xmlns:cx6="http://schemas.microsoft.com/office/drawing/2016/5/12/chartex" xmlns:cx7="http://schemas.microsoft.com/office/drawing/2016/5/13/chartex" xmlns:cx8="http://schemas.microsoft.com/office/drawing/2016/5/14/chartex" xmlns:mc="http://schemas.openxmlformats.org/markup-compatibility/2006" xmlns:aink="http://schemas.microsoft.com/office/drawing/2016/ink" xmlns:am3d="http://schemas.microsoft.com/office/drawing/2017/model3d" xmlns:o="urn:schemas-microsoft-com:office:office" xmlns:oel="http://schemas.microsoft.com/office/2019/extlst" xmlns:r="http://schemas.openxmlformats.org/officeDocument/2006/relationships" xmlns:m="http://schemas.openxmlformats.org/officeDocument/2006/math" xmlns:v="urn:schemas-microsoft-com:vml" xmlns:wp14="http://schemas.microsoft.com/office/word/2010/wordprocessingDrawing" xmlns:wp="http://schemas.openxmlformats.org/drawingml/2006/wordprocessingDrawing" xmlns:w10="urn:schemas-microsoft-com:office:word" xmlns:w="http://schemas.openxmlformats.org/wordprocessingml/2006/main" xmlns:w14="http://schemas.microsoft.com/office/word/2010/wordml" xmlns:w15="http://schemas.microsoft.com/office/word/2012/wordml" xmlns:w16cex="http://schemas.microsoft.com/office/word/2018/wordml/cex" xmlns:w16cid="http://schemas.microsoft.com/office/word/2016/wordml/cid" xmlns:w16="http://schemas.microsoft.com/office/word/2018/wordml" xmlns:w16sdtdh="http://schemas.microsoft.com/office/word/2020/wordml/sdtdatahash" xmlns:w16se="http://schemas.microsoft.com/office/word/2015/wordml/symex" xmlns:wpg="http://schemas.microsoft.com/office/word/2010/wordprocessingGroup" xmlns:wpi="http://schemas.microsoft.com/office/word/2010/wordprocessingInk" xmlns:wne="http://schemas.microsoft.com/office/word/2006/wordml" xmlns:wps="http://schemas.microsoft.com/office/word/2010/wordprocessingShape" mc:Ignorable="w14 w15 w16se w16cid w16 w16cex w16sdtdh wp14">
   <w:footnote w:type="separator" w:id="-1">
     <w:p>
       <w:pPr>
@@ -30907,7 +30867,7 @@
 </file>
 
 <file path=word/header1.xml><?xml version="1.0" encoding="utf-8"?>
-<w:hdr xmlns:wpc="http://schemas.microsoft.com/office/word/2010/wordprocessingCanvas" xmlns:cx="http://schemas.microsoft.com/office/drawing/2014/chartex" xmlns:cx1="http://schemas.microsoft.com/office/drawing/2015/9/8/chartex" xmlns:cx2="http://schemas.microsoft.com/office/drawing/2015/10/21/chartex" xmlns:cx3="http://schemas.microsoft.com/office/drawing/2016/5/9/chartex" xmlns:cx4="http://schemas.microsoft.com/office/drawing/2016/5/10/chartex" xmlns:cx5="http://schemas.microsoft.com/office/drawing/2016/5/11/chartex" xmlns:cx6="http://schemas.microsoft.com/office/drawing/2016/5/12/chartex" xmlns:cx7="http://schemas.microsoft.com/office/drawing/2016/5/13/chartex" xmlns:cx8="http://schemas.microsoft.com/office/drawing/2016/5/14/chartex" xmlns:mc="http://schemas.openxmlformats.org/markup-compatibility/2006" xmlns:aink="http://schemas.microsoft.com/office/drawing/2016/ink" xmlns:am3d="http://schemas.microsoft.com/office/drawing/2017/model3d" xmlns:o="urn:schemas-microsoft-com:office:office" xmlns:oel="http://schemas.microsoft.com/office/2019/extlst" xmlns:r="http://schemas.openxmlformats.org/officeDocument/2006/relationships" xmlns:m="http://schemas.openxmlformats.org/officeDocument/2006/math" xmlns:v="urn:schemas-microsoft-com:vml" xmlns:wp14="http://schemas.microsoft.com/office/word/2010/wordprocessingDrawing" xmlns:wp="http://schemas.openxmlformats.org/drawingml/2006/wordprocessingDrawing" xmlns:w10="urn:schemas-microsoft-com:office:word" xmlns:w="http://schemas.openxmlformats.org/wordprocessingml/2006/main" xmlns:w14="http://schemas.microsoft.com/office/word/2010/wordml" xmlns:w15="http://schemas.microsoft.com/office/word/2012/wordml" xmlns:w16cex="http://schemas.microsoft.com/office/word/2018/wordml/cex" xmlns:w16cid="http://schemas.microsoft.com/office/word/2016/wordml/cid" xmlns:w16="http://schemas.microsoft.com/office/word/2018/wordml" xmlns:w16du="http://schemas.microsoft.com/office/word/2023/wordml/word16du" xmlns:w16sdtdh="http://schemas.microsoft.com/office/word/2020/wordml/sdtdatahash" xmlns:w16sdtfl="http://schemas.microsoft.com/office/word/2024/wordml/sdtformatlock" xmlns:w16se="http://schemas.microsoft.com/office/word/2015/wordml/symex" xmlns:wpg="http://schemas.microsoft.com/office/word/2010/wordprocessingGroup" xmlns:wpi="http://schemas.microsoft.com/office/word/2010/wordprocessingInk" xmlns:wne="http://schemas.microsoft.com/office/word/2006/wordml" xmlns:wps="http://schemas.microsoft.com/office/word/2010/wordprocessingShape" mc:Ignorable="w14 w15 w16se w16cid w16 w16cex w16sdtdh w16sdtfl w16du wp14">
+<w:hdr xmlns:wpc="http://schemas.microsoft.com/office/word/2010/wordprocessingCanvas" xmlns:cx="http://schemas.microsoft.com/office/drawing/2014/chartex" xmlns:cx1="http://schemas.microsoft.com/office/drawing/2015/9/8/chartex" xmlns:cx2="http://schemas.microsoft.com/office/drawing/2015/10/21/chartex" xmlns:cx3="http://schemas.microsoft.com/office/drawing/2016/5/9/chartex" xmlns:cx4="http://schemas.microsoft.com/office/drawing/2016/5/10/chartex" xmlns:cx5="http://schemas.microsoft.com/office/drawing/2016/5/11/chartex" xmlns:cx6="http://schemas.microsoft.com/office/drawing/2016/5/12/chartex" xmlns:cx7="http://schemas.microsoft.com/office/drawing/2016/5/13/chartex" xmlns:cx8="http://schemas.microsoft.com/office/drawing/2016/5/14/chartex" xmlns:mc="http://schemas.openxmlformats.org/markup-compatibility/2006" xmlns:aink="http://schemas.microsoft.com/office/drawing/2016/ink" xmlns:am3d="http://schemas.microsoft.com/office/drawing/2017/model3d" xmlns:o="urn:schemas-microsoft-com:office:office" xmlns:oel="http://schemas.microsoft.com/office/2019/extlst" xmlns:r="http://schemas.openxmlformats.org/officeDocument/2006/relationships" xmlns:m="http://schemas.openxmlformats.org/officeDocument/2006/math" xmlns:v="urn:schemas-microsoft-com:vml" xmlns:wp14="http://schemas.microsoft.com/office/word/2010/wordprocessingDrawing" xmlns:wp="http://schemas.openxmlformats.org/drawingml/2006/wordprocessingDrawing" xmlns:w10="urn:schemas-microsoft-com:office:word" xmlns:w="http://schemas.openxmlformats.org/wordprocessingml/2006/main" xmlns:w14="http://schemas.microsoft.com/office/word/2010/wordml" xmlns:w15="http://schemas.microsoft.com/office/word/2012/wordml" xmlns:w16cex="http://schemas.microsoft.com/office/word/2018/wordml/cex" xmlns:w16cid="http://schemas.microsoft.com/office/word/2016/wordml/cid" xmlns:w16="http://schemas.microsoft.com/office/word/2018/wordml" xmlns:w16sdtdh="http://schemas.microsoft.com/office/word/2020/wordml/sdtdatahash" xmlns:w16se="http://schemas.microsoft.com/office/word/2015/wordml/symex" xmlns:wpg="http://schemas.microsoft.com/office/word/2010/wordprocessingGroup" xmlns:wpi="http://schemas.microsoft.com/office/word/2010/wordprocessingInk" xmlns:wne="http://schemas.microsoft.com/office/word/2006/wordml" xmlns:wps="http://schemas.microsoft.com/office/word/2010/wordprocessingShape" mc:Ignorable="w14 w15 w16se w16cid w16 w16cex w16sdtdh wp14">
   <w:p>
     <w:pPr>
       <w:pStyle w:val="Header"/>
@@ -30917,7 +30877,7 @@
 </file>
 
 <file path=word/header2.xml><?xml version="1.0" encoding="utf-8"?>
-<w:hdr xmlns:wpc="http://schemas.microsoft.com/office/word/2010/wordprocessingCanvas" xmlns:cx="http://schemas.microsoft.com/office/drawing/2014/chartex" xmlns:cx1="http://schemas.microsoft.com/office/drawing/2015/9/8/chartex" xmlns:cx2="http://schemas.microsoft.com/office/drawing/2015/10/21/chartex" xmlns:cx3="http://schemas.microsoft.com/office/drawing/2016/5/9/chartex" xmlns:cx4="http://schemas.microsoft.com/office/drawing/2016/5/10/chartex" xmlns:cx5="http://schemas.microsoft.com/office/drawing/2016/5/11/chartex" xmlns:cx6="http://schemas.microsoft.com/office/drawing/2016/5/12/chartex" xmlns:cx7="http://schemas.microsoft.com/office/drawing/2016/5/13/chartex" xmlns:cx8="http://schemas.microsoft.com/office/drawing/2016/5/14/chartex" xmlns:mc="http://schemas.openxmlformats.org/markup-compatibility/2006" xmlns:aink="http://schemas.microsoft.com/office/drawing/2016/ink" xmlns:am3d="http://schemas.microsoft.com/office/drawing/2017/model3d" xmlns:o="urn:schemas-microsoft-com:office:office" xmlns:oel="http://schemas.microsoft.com/office/2019/extlst" xmlns:r="http://schemas.openxmlformats.org/officeDocument/2006/relationships" xmlns:m="http://schemas.openxmlformats.org/officeDocument/2006/math" xmlns:v="urn:schemas-microsoft-com:vml" xmlns:wp14="http://schemas.microsoft.com/office/word/2010/wordprocessingDrawing" xmlns:wp="http://schemas.openxmlformats.org/drawingml/2006/wordprocessingDrawing" xmlns:w10="urn:schemas-microsoft-com:office:word" xmlns:w="http://schemas.openxmlformats.org/wordprocessingml/2006/main" xmlns:w14="http://schemas.microsoft.com/office/word/2010/wordml" xmlns:w15="http://schemas.microsoft.com/office/word/2012/wordml" xmlns:w16cex="http://schemas.microsoft.com/office/word/2018/wordml/cex" xmlns:w16cid="http://schemas.microsoft.com/office/word/2016/wordml/cid" xmlns:w16="http://schemas.microsoft.com/office/word/2018/wordml" xmlns:w16du="http://schemas.microsoft.com/office/word/2023/wordml/word16du" xmlns:w16sdtdh="http://schemas.microsoft.com/office/word/2020/wordml/sdtdatahash" xmlns:w16sdtfl="http://schemas.microsoft.com/office/word/2024/wordml/sdtformatlock" xmlns:w16se="http://schemas.microsoft.com/office/word/2015/wordml/symex" xmlns:wpg="http://schemas.microsoft.com/office/word/2010/wordprocessingGroup" xmlns:wpi="http://schemas.microsoft.com/office/word/2010/wordprocessingInk" xmlns:wne="http://schemas.microsoft.com/office/word/2006/wordml" xmlns:wps="http://schemas.microsoft.com/office/word/2010/wordprocessingShape" mc:Ignorable="w14 w15 w16se w16cid w16 w16cex w16sdtdh w16sdtfl w16du wp14">
+<w:hdr xmlns:wpc="http://schemas.microsoft.com/office/word/2010/wordprocessingCanvas" xmlns:cx="http://schemas.microsoft.com/office/drawing/2014/chartex" xmlns:cx1="http://schemas.microsoft.com/office/drawing/2015/9/8/chartex" xmlns:cx2="http://schemas.microsoft.com/office/drawing/2015/10/21/chartex" xmlns:cx3="http://schemas.microsoft.com/office/drawing/2016/5/9/chartex" xmlns:cx4="http://schemas.microsoft.com/office/drawing/2016/5/10/chartex" xmlns:cx5="http://schemas.microsoft.com/office/drawing/2016/5/11/chartex" xmlns:cx6="http://schemas.microsoft.com/office/drawing/2016/5/12/chartex" xmlns:cx7="http://schemas.microsoft.com/office/drawing/2016/5/13/chartex" xmlns:cx8="http://schemas.microsoft.com/office/drawing/2016/5/14/chartex" xmlns:mc="http://schemas.openxmlformats.org/markup-compatibility/2006" xmlns:aink="http://schemas.microsoft.com/office/drawing/2016/ink" xmlns:am3d="http://schemas.microsoft.com/office/drawing/2017/model3d" xmlns:o="urn:schemas-microsoft-com:office:office" xmlns:oel="http://schemas.microsoft.com/office/2019/extlst" xmlns:r="http://schemas.openxmlformats.org/officeDocument/2006/relationships" xmlns:m="http://schemas.openxmlformats.org/officeDocument/2006/math" xmlns:v="urn:schemas-microsoft-com:vml" xmlns:wp14="http://schemas.microsoft.com/office/word/2010/wordprocessingDrawing" xmlns:wp="http://schemas.openxmlformats.org/drawingml/2006/wordprocessingDrawing" xmlns:w10="urn:schemas-microsoft-com:office:word" xmlns:w="http://schemas.openxmlformats.org/wordprocessingml/2006/main" xmlns:w14="http://schemas.microsoft.com/office/word/2010/wordml" xmlns:w15="http://schemas.microsoft.com/office/word/2012/wordml" xmlns:w16cex="http://schemas.microsoft.com/office/word/2018/wordml/cex" xmlns:w16cid="http://schemas.microsoft.com/office/word/2016/wordml/cid" xmlns:w16="http://schemas.microsoft.com/office/word/2018/wordml" xmlns:w16sdtdh="http://schemas.microsoft.com/office/word/2020/wordml/sdtdatahash" xmlns:w16se="http://schemas.microsoft.com/office/word/2015/wordml/symex" xmlns:wpg="http://schemas.microsoft.com/office/word/2010/wordprocessingGroup" xmlns:wpi="http://schemas.microsoft.com/office/word/2010/wordprocessingInk" xmlns:wne="http://schemas.microsoft.com/office/word/2006/wordml" xmlns:wps="http://schemas.microsoft.com/office/word/2010/wordprocessingShape" mc:Ignorable="w14 w15 w16se w16cid w16 w16cex w16sdtdh wp14">
   <w:p>
     <w:pPr>
       <w:pStyle w:val="Header"/>
@@ -30927,7 +30887,7 @@
 </file>
 
 <file path=word/header3.xml><?xml version="1.0" encoding="utf-8"?>
-<w:hdr xmlns:wpc="http://schemas.microsoft.com/office/word/2010/wordprocessingCanvas" xmlns:cx="http://schemas.microsoft.com/office/drawing/2014/chartex" xmlns:cx1="http://schemas.microsoft.com/office/drawing/2015/9/8/chartex" xmlns:cx2="http://schemas.microsoft.com/office/drawing/2015/10/21/chartex" xmlns:cx3="http://schemas.microsoft.com/office/drawing/2016/5/9/chartex" xmlns:cx4="http://schemas.microsoft.com/office/drawing/2016/5/10/chartex" xmlns:cx5="http://schemas.microsoft.com/office/drawing/2016/5/11/chartex" xmlns:cx6="http://schemas.microsoft.com/office/drawing/2016/5/12/chartex" xmlns:cx7="http://schemas.microsoft.com/office/drawing/2016/5/13/chartex" xmlns:cx8="http://schemas.microsoft.com/office/drawing/2016/5/14/chartex" xmlns:mc="http://schemas.openxmlformats.org/markup-compatibility/2006" xmlns:aink="http://schemas.microsoft.com/office/drawing/2016/ink" xmlns:am3d="http://schemas.microsoft.com/office/drawing/2017/model3d" xmlns:o="urn:schemas-microsoft-com:office:office" xmlns:oel="http://schemas.microsoft.com/office/2019/extlst" xmlns:r="http://schemas.openxmlformats.org/officeDocument/2006/relationships" xmlns:m="http://schemas.openxmlformats.org/officeDocument/2006/math" xmlns:v="urn:schemas-microsoft-com:vml" xmlns:wp14="http://schemas.microsoft.com/office/word/2010/wordprocessingDrawing" xmlns:wp="http://schemas.openxmlformats.org/drawingml/2006/wordprocessingDrawing" xmlns:w10="urn:schemas-microsoft-com:office:word" xmlns:w="http://schemas.openxmlformats.org/wordprocessingml/2006/main" xmlns:w14="http://schemas.microsoft.com/office/word/2010/wordml" xmlns:w15="http://schemas.microsoft.com/office/word/2012/wordml" xmlns:w16cex="http://schemas.microsoft.com/office/word/2018/wordml/cex" xmlns:w16cid="http://schemas.microsoft.com/office/word/2016/wordml/cid" xmlns:w16="http://schemas.microsoft.com/office/word/2018/wordml" xmlns:w16du="http://schemas.microsoft.com/office/word/2023/wordml/word16du" xmlns:w16sdtdh="http://schemas.microsoft.com/office/word/2020/wordml/sdtdatahash" xmlns:w16sdtfl="http://schemas.microsoft.com/office/word/2024/wordml/sdtformatlock" xmlns:w16se="http://schemas.microsoft.com/office/word/2015/wordml/symex" xmlns:wpg="http://schemas.microsoft.com/office/word/2010/wordprocessingGroup" xmlns:wpi="http://schemas.microsoft.com/office/word/2010/wordprocessingInk" xmlns:wne="http://schemas.microsoft.com/office/word/2006/wordml" xmlns:wps="http://schemas.microsoft.com/office/word/2010/wordprocessingShape" mc:Ignorable="w14 w15 w16se w16cid w16 w16cex w16sdtdh w16sdtfl w16du wp14">
+<w:hdr xmlns:wpc="http://schemas.microsoft.com/office/word/2010/wordprocessingCanvas" xmlns:cx="http://schemas.microsoft.com/office/drawing/2014/chartex" xmlns:cx1="http://schemas.microsoft.com/office/drawing/2015/9/8/chartex" xmlns:cx2="http://schemas.microsoft.com/office/drawing/2015/10/21/chartex" xmlns:cx3="http://schemas.microsoft.com/office/drawing/2016/5/9/chartex" xmlns:cx4="http://schemas.microsoft.com/office/drawing/2016/5/10/chartex" xmlns:cx5="http://schemas.microsoft.com/office/drawing/2016/5/11/chartex" xmlns:cx6="http://schemas.microsoft.com/office/drawing/2016/5/12/chartex" xmlns:cx7="http://schemas.microsoft.com/office/drawing/2016/5/13/chartex" xmlns:cx8="http://schemas.microsoft.com/office/drawing/2016/5/14/chartex" xmlns:mc="http://schemas.openxmlformats.org/markup-compatibility/2006" xmlns:aink="http://schemas.microsoft.com/office/drawing/2016/ink" xmlns:am3d="http://schemas.microsoft.com/office/drawing/2017/model3d" xmlns:o="urn:schemas-microsoft-com:office:office" xmlns:oel="http://schemas.microsoft.com/office/2019/extlst" xmlns:r="http://schemas.openxmlformats.org/officeDocument/2006/relationships" xmlns:m="http://schemas.openxmlformats.org/officeDocument/2006/math" xmlns:v="urn:schemas-microsoft-com:vml" xmlns:wp14="http://schemas.microsoft.com/office/word/2010/wordprocessingDrawing" xmlns:wp="http://schemas.openxmlformats.org/drawingml/2006/wordprocessingDrawing" xmlns:w10="urn:schemas-microsoft-com:office:word" xmlns:w="http://schemas.openxmlformats.org/wordprocessingml/2006/main" xmlns:w14="http://schemas.microsoft.com/office/word/2010/wordml" xmlns:w15="http://schemas.microsoft.com/office/word/2012/wordml" xmlns:w16cex="http://schemas.microsoft.com/office/word/2018/wordml/cex" xmlns:w16cid="http://schemas.microsoft.com/office/word/2016/wordml/cid" xmlns:w16="http://schemas.microsoft.com/office/word/2018/wordml" xmlns:w16sdtdh="http://schemas.microsoft.com/office/word/2020/wordml/sdtdatahash" xmlns:w16se="http://schemas.microsoft.com/office/word/2015/wordml/symex" xmlns:wpg="http://schemas.microsoft.com/office/word/2010/wordprocessingGroup" xmlns:wpi="http://schemas.microsoft.com/office/word/2010/wordprocessingInk" xmlns:wne="http://schemas.microsoft.com/office/word/2006/wordml" xmlns:wps="http://schemas.microsoft.com/office/word/2010/wordprocessingShape" mc:Ignorable="w14 w15 w16se w16cid w16 w16cex w16sdtdh wp14">
   <w:p>
     <w:pPr>
       <w:pStyle w:val="Header"/>
@@ -30937,7 +30897,7 @@
 </file>
 
 <file path=word/numbering.xml><?xml version="1.0" encoding="utf-8"?>
-<w:numbering xmlns:wpc="http://schemas.microsoft.com/office/word/2010/wordprocessingCanvas" xmlns:cx="http://schemas.microsoft.com/office/drawing/2014/chartex" xmlns:cx1="http://schemas.microsoft.com/office/drawing/2015/9/8/chartex" xmlns:cx2="http://schemas.microsoft.com/office/drawing/2015/10/21/chartex" xmlns:cx3="http://schemas.microsoft.com/office/drawing/2016/5/9/chartex" xmlns:cx4="http://schemas.microsoft.com/office/drawing/2016/5/10/chartex" xmlns:cx5="http://schemas.microsoft.com/office/drawing/2016/5/11/chartex" xmlns:cx6="http://schemas.microsoft.com/office/drawing/2016/5/12/chartex" xmlns:cx7="http://schemas.microsoft.com/office/drawing/2016/5/13/chartex" xmlns:cx8="http://schemas.microsoft.com/office/drawing/2016/5/14/chartex" xmlns:mc="http://schemas.openxmlformats.org/markup-compatibility/2006" xmlns:aink="http://schemas.microsoft.com/office/drawing/2016/ink" xmlns:am3d="http://schemas.microsoft.com/office/drawing/2017/model3d" xmlns:o="urn:schemas-microsoft-com:office:office" xmlns:oel="http://schemas.microsoft.com/office/2019/extlst" xmlns:r="http://schemas.openxmlformats.org/officeDocument/2006/relationships" xmlns:m="http://schemas.openxmlformats.org/officeDocument/2006/math" xmlns:v="urn:schemas-microsoft-com:vml" xmlns:wp14="http://schemas.microsoft.com/office/word/2010/wordprocessingDrawing" xmlns:wp="http://schemas.openxmlformats.org/drawingml/2006/wordprocessingDrawing" xmlns:w10="urn:schemas-microsoft-com:office:word" xmlns:w="http://schemas.openxmlformats.org/wordprocessingml/2006/main" xmlns:w14="http://schemas.microsoft.com/office/word/2010/wordml" xmlns:w15="http://schemas.microsoft.com/office/word/2012/wordml" xmlns:w16cex="http://schemas.microsoft.com/office/word/2018/wordml/cex" xmlns:w16cid="http://schemas.microsoft.com/office/word/2016/wordml/cid" xmlns:w16="http://schemas.microsoft.com/office/word/2018/wordml" xmlns:w16du="http://schemas.microsoft.com/office/word/2023/wordml/word16du" xmlns:w16sdtdh="http://schemas.microsoft.com/office/word/2020/wordml/sdtdatahash" xmlns:w16sdtfl="http://schemas.microsoft.com/office/word/2024/wordml/sdtformatlock" xmlns:w16se="http://schemas.microsoft.com/office/word/2015/wordml/symex" xmlns:wpg="http://schemas.microsoft.com/office/word/2010/wordprocessingGroup" xmlns:wpi="http://schemas.microsoft.com/office/word/2010/wordprocessingInk" xmlns:wne="http://schemas.microsoft.com/office/word/2006/wordml" xmlns:wps="http://schemas.microsoft.com/office/word/2010/wordprocessingShape" mc:Ignorable="w14 w15 w16se w16cid w16 w16cex w16sdtdh w16sdtfl w16du wp14">
+<w:numbering xmlns:wpc="http://schemas.microsoft.com/office/word/2010/wordprocessingCanvas" xmlns:cx="http://schemas.microsoft.com/office/drawing/2014/chartex" xmlns:cx1="http://schemas.microsoft.com/office/drawing/2015/9/8/chartex" xmlns:cx2="http://schemas.microsoft.com/office/drawing/2015/10/21/chartex" xmlns:cx3="http://schemas.microsoft.com/office/drawing/2016/5/9/chartex" xmlns:cx4="http://schemas.microsoft.com/office/drawing/2016/5/10/chartex" xmlns:cx5="http://schemas.microsoft.com/office/drawing/2016/5/11/chartex" xmlns:cx6="http://schemas.microsoft.com/office/drawing/2016/5/12/chartex" xmlns:cx7="http://schemas.microsoft.com/office/drawing/2016/5/13/chartex" xmlns:cx8="http://schemas.microsoft.com/office/drawing/2016/5/14/chartex" xmlns:mc="http://schemas.openxmlformats.org/markup-compatibility/2006" xmlns:aink="http://schemas.microsoft.com/office/drawing/2016/ink" xmlns:am3d="http://schemas.microsoft.com/office/drawing/2017/model3d" xmlns:o="urn:schemas-microsoft-com:office:office" xmlns:oel="http://schemas.microsoft.com/office/2019/extlst" xmlns:r="http://schemas.openxmlformats.org/officeDocument/2006/relationships" xmlns:m="http://schemas.openxmlformats.org/officeDocument/2006/math" xmlns:v="urn:schemas-microsoft-com:vml" xmlns:wp14="http://schemas.microsoft.com/office/word/2010/wordprocessingDrawing" xmlns:wp="http://schemas.openxmlformats.org/drawingml/2006/wordprocessingDrawing" xmlns:w10="urn:schemas-microsoft-com:office:word" xmlns:w="http://schemas.openxmlformats.org/wordprocessingml/2006/main" xmlns:w14="http://schemas.microsoft.com/office/word/2010/wordml" xmlns:w15="http://schemas.microsoft.com/office/word/2012/wordml" xmlns:w16cex="http://schemas.microsoft.com/office/word/2018/wordml/cex" xmlns:w16cid="http://schemas.microsoft.com/office/word/2016/wordml/cid" xmlns:w16="http://schemas.microsoft.com/office/word/2018/wordml" xmlns:w16sdtdh="http://schemas.microsoft.com/office/word/2020/wordml/sdtdatahash" xmlns:w16se="http://schemas.microsoft.com/office/word/2015/wordml/symex" xmlns:wpg="http://schemas.microsoft.com/office/word/2010/wordprocessingGroup" xmlns:wpi="http://schemas.microsoft.com/office/word/2010/wordprocessingInk" xmlns:wne="http://schemas.microsoft.com/office/word/2006/wordml" xmlns:wps="http://schemas.microsoft.com/office/word/2010/wordprocessingShape" mc:Ignorable="w14 w15 w16se w16cid w16 w16cex w16sdtdh wp14">
   <w:abstractNum w:abstractNumId="0" w15:restartNumberingAfterBreak="0">
     <w:nsid w:val="054E2E01"/>
     <w:multiLevelType w:val="hybridMultilevel"/>
@@ -34928,7 +34888,7 @@
 </file>
 
 <file path=word/styles.xml><?xml version="1.0" encoding="utf-8"?>
-<w:styles xmlns:mc="http://schemas.openxmlformats.org/markup-compatibility/2006" xmlns:r="http://schemas.openxmlformats.org/officeDocument/2006/relationships" xmlns:w="http://schemas.openxmlformats.org/wordprocessingml/2006/main" xmlns:w14="http://schemas.microsoft.com/office/word/2010/wordml" xmlns:w15="http://schemas.microsoft.com/office/word/2012/wordml" xmlns:w16cex="http://schemas.microsoft.com/office/word/2018/wordml/cex" xmlns:w16cid="http://schemas.microsoft.com/office/word/2016/wordml/cid" xmlns:w16="http://schemas.microsoft.com/office/word/2018/wordml" xmlns:w16du="http://schemas.microsoft.com/office/word/2023/wordml/word16du" xmlns:w16sdtdh="http://schemas.microsoft.com/office/word/2020/wordml/sdtdatahash" xmlns:w16sdtfl="http://schemas.microsoft.com/office/word/2024/wordml/sdtformatlock" xmlns:w16se="http://schemas.microsoft.com/office/word/2015/wordml/symex" mc:Ignorable="w14 w15 w16se w16cid w16 w16cex w16sdtdh w16sdtfl w16du">
+<w:styles xmlns:mc="http://schemas.openxmlformats.org/markup-compatibility/2006" xmlns:r="http://schemas.openxmlformats.org/officeDocument/2006/relationships" xmlns:w="http://schemas.openxmlformats.org/wordprocessingml/2006/main" xmlns:w14="http://schemas.microsoft.com/office/word/2010/wordml" xmlns:w15="http://schemas.microsoft.com/office/word/2012/wordml" xmlns:w16cex="http://schemas.microsoft.com/office/word/2018/wordml/cex" xmlns:w16cid="http://schemas.microsoft.com/office/word/2016/wordml/cid" xmlns:w16="http://schemas.microsoft.com/office/word/2018/wordml" xmlns:w16sdtdh="http://schemas.microsoft.com/office/word/2020/wordml/sdtdatahash" xmlns:w16se="http://schemas.microsoft.com/office/word/2015/wordml/symex" mc:Ignorable="w14 w15 w16se w16cid w16 w16cex w16sdtdh">
   <w:docDefaults>
     <w:rPrDefault>
       <w:rPr>

</xml_diff>